<commit_message>
update some results and the instructions for claude
</commit_message>
<xml_diff>
--- a/model_fit_comparison.docx
+++ b/model_fit_comparison.docx
@@ -394,7 +394,7 @@
                 <w:szCs w:val="22"/>
                 <w:color w:val="000000"/>
               </w:rPr>
-              <w:t xml:space="preserve">-3,540.364</w:t>
+              <w:t xml:space="preserve">-3,727.346</w:t>
             </w:r>
           </w:p>
         </w:tc>
@@ -447,7 +447,7 @@
                 <w:szCs w:val="22"/>
                 <w:color w:val="000000"/>
               </w:rPr>
-              <w:t xml:space="preserve">7,126.727</w:t>
+              <w:t xml:space="preserve">7,500.693</w:t>
             </w:r>
           </w:p>
         </w:tc>
@@ -500,7 +500,7 @@
                 <w:szCs w:val="22"/>
                 <w:color w:val="000000"/>
               </w:rPr>
-              <w:t xml:space="preserve">7,234.009</w:t>
+              <w:t xml:space="preserve">7,612.752</w:t>
             </w:r>
           </w:p>
         </w:tc>
@@ -553,7 +553,7 @@
                 <w:szCs w:val="22"/>
                 <w:color w:val="000000"/>
               </w:rPr>
-              <w:t xml:space="preserve">0.0718816</w:t>
+              <w:t xml:space="preserve">0.4352975</w:t>
             </w:r>
           </w:p>
         </w:tc>
@@ -665,7 +665,7 @@
                 <w:szCs w:val="22"/>
                 <w:color w:val="000000"/>
               </w:rPr>
-              <w:t xml:space="preserve">-3,549.346</w:t>
+              <w:t xml:space="preserve">-3,939.183</w:t>
             </w:r>
           </w:p>
         </w:tc>
@@ -718,7 +718,7 @@
                 <w:szCs w:val="22"/>
                 <w:color w:val="000000"/>
               </w:rPr>
-              <w:t xml:space="preserve">7,124.691</w:t>
+              <w:t xml:space="preserve">7,904.366</w:t>
             </w:r>
           </w:p>
         </w:tc>
@@ -771,7 +771,7 @@
                 <w:szCs w:val="22"/>
                 <w:color w:val="000000"/>
               </w:rPr>
-              <w:t xml:space="preserve">7,185.329</w:t>
+              <w:t xml:space="preserve">7,967.704</w:t>
             </w:r>
           </w:p>
         </w:tc>
@@ -824,7 +824,7 @@
                 <w:szCs w:val="22"/>
                 <w:color w:val="000000"/>
               </w:rPr>
-              <w:t xml:space="preserve">0.0718816</w:t>
+              <w:t xml:space="preserve">0.4352975</w:t>
             </w:r>
           </w:p>
         </w:tc>

</xml_diff>